<commit_message>
docs: finalize academic V6 analysis report
</commit_message>
<xml_diff>
--- a/RAPOR_AKADEMIK_REGISTRATION_RADIOMICS_V6.docx
+++ b/RAPOR_AKADEMIK_REGISTRATION_RADIOMICS_V6.docx
@@ -1586,6 +1586,386 @@
     </w:tbl>
     <w:p/>
     <w:p>
+      <w:r>
+        <w:t>Belirsizlik için oturum eşleşmeleri 5,000 tekrarlı paired bootstrap ile örneklendi. ‘Improved’ 95% CI’nin sıfırın tamamen altında; ‘worsened’ tamamen üstünde; ‘uncertain’ ise sıfırı içerdiği anlamına gelir.</w:t>
+      </w:r>
+    </w:p>
+    <w:tbl>
+      <w:tblPr>
+        <w:tblStyle w:val="LightShading-Accent1"/>
+        <w:tblW w:type="auto" w:w="0"/>
+        <w:jc w:val="center"/>
+        <w:tblLook w:firstColumn="1" w:firstRow="1" w:lastColumn="0" w:lastRow="0" w:noHBand="0" w:noVBand="1" w:val="04A0"/>
+      </w:tblPr>
+      <w:tblGrid>
+        <w:gridCol w:w="1656"/>
+        <w:gridCol w:w="1656"/>
+        <w:gridCol w:w="1656"/>
+        <w:gridCol w:w="1656"/>
+        <w:gridCol w:w="1656"/>
+        <w:gridCol w:w="1656"/>
+      </w:tblGrid>
+      <w:tr>
+        <w:tc>
+          <w:tcPr>
+            <w:tcW w:type="dxa" w:w="1656"/>
+            <w:vAlign w:val="center"/>
+          </w:tcPr>
+          <w:p>
+            <w:r>
+              <w:rPr>
+                <w:b/>
+              </w:rPr>
+              <w:t>Mode</w:t>
+            </w:r>
+          </w:p>
+        </w:tc>
+        <w:tc>
+          <w:tcPr>
+            <w:tcW w:type="dxa" w:w="1656"/>
+            <w:vAlign w:val="center"/>
+          </w:tcPr>
+          <w:p>
+            <w:r>
+              <w:rPr>
+                <w:b/>
+              </w:rPr>
+              <w:t>Ölçü</w:t>
+            </w:r>
+          </w:p>
+        </w:tc>
+        <w:tc>
+          <w:tcPr>
+            <w:tcW w:type="dxa" w:w="1656"/>
+            <w:vAlign w:val="center"/>
+          </w:tcPr>
+          <w:p>
+            <w:r>
+              <w:rPr>
+                <w:b/>
+              </w:rPr>
+              <w:t>Test</w:t>
+            </w:r>
+          </w:p>
+        </w:tc>
+        <w:tc>
+          <w:tcPr>
+            <w:tcW w:type="dxa" w:w="1656"/>
+            <w:vAlign w:val="center"/>
+          </w:tcPr>
+          <w:p>
+            <w:r>
+              <w:rPr>
+                <w:b/>
+              </w:rPr>
+              <w:t>CI iyileşme</w:t>
+            </w:r>
+          </w:p>
+        </w:tc>
+        <w:tc>
+          <w:tcPr>
+            <w:tcW w:type="dxa" w:w="1656"/>
+            <w:vAlign w:val="center"/>
+          </w:tcPr>
+          <w:p>
+            <w:r>
+              <w:rPr>
+                <w:b/>
+              </w:rPr>
+              <w:t>CI kötüleşme</w:t>
+            </w:r>
+          </w:p>
+        </w:tc>
+        <w:tc>
+          <w:tcPr>
+            <w:tcW w:type="dxa" w:w="1656"/>
+            <w:vAlign w:val="center"/>
+          </w:tcPr>
+          <w:p>
+            <w:r>
+              <w:rPr>
+                <w:b/>
+              </w:rPr>
+              <w:t>Belirsiz</w:t>
+            </w:r>
+          </w:p>
+        </w:tc>
+      </w:tr>
+      <w:tr>
+        <w:tc>
+          <w:tcPr>
+            <w:tcW w:type="dxa" w:w="1656"/>
+            <w:vAlign w:val="center"/>
+          </w:tcPr>
+          <w:p>
+            <w:r>
+              <w:t>3D</w:t>
+            </w:r>
+          </w:p>
+        </w:tc>
+        <w:tc>
+          <w:tcPr>
+            <w:tcW w:type="dxa" w:w="1656"/>
+            <w:vAlign w:val="center"/>
+          </w:tcPr>
+          <w:p>
+            <w:r>
+              <w:t>CV</w:t>
+            </w:r>
+          </w:p>
+        </w:tc>
+        <w:tc>
+          <w:tcPr>
+            <w:tcW w:type="dxa" w:w="1656"/>
+            <w:vAlign w:val="center"/>
+          </w:tcPr>
+          <w:p>
+            <w:r>
+              <w:t>418</w:t>
+            </w:r>
+          </w:p>
+        </w:tc>
+        <w:tc>
+          <w:tcPr>
+            <w:tcW w:type="dxa" w:w="1656"/>
+            <w:vAlign w:val="center"/>
+          </w:tcPr>
+          <w:p>
+            <w:r>
+              <w:t>14</w:t>
+            </w:r>
+          </w:p>
+        </w:tc>
+        <w:tc>
+          <w:tcPr>
+            <w:tcW w:type="dxa" w:w="1656"/>
+            <w:vAlign w:val="center"/>
+          </w:tcPr>
+          <w:p>
+            <w:r>
+              <w:t>74</w:t>
+            </w:r>
+          </w:p>
+        </w:tc>
+        <w:tc>
+          <w:tcPr>
+            <w:tcW w:type="dxa" w:w="1656"/>
+            <w:vAlign w:val="center"/>
+          </w:tcPr>
+          <w:p>
+            <w:r>
+              <w:t>330</w:t>
+            </w:r>
+          </w:p>
+        </w:tc>
+      </w:tr>
+      <w:tr>
+        <w:tc>
+          <w:tcPr>
+            <w:tcW w:type="dxa" w:w="1656"/>
+            <w:vAlign w:val="center"/>
+          </w:tcPr>
+          <w:p>
+            <w:r>
+              <w:t>3D</w:t>
+            </w:r>
+          </w:p>
+        </w:tc>
+        <w:tc>
+          <w:tcPr>
+            <w:tcW w:type="dxa" w:w="1656"/>
+            <w:vAlign w:val="center"/>
+          </w:tcPr>
+          <w:p>
+            <w:r>
+              <w:t>Pairwise relative difference</w:t>
+            </w:r>
+          </w:p>
+        </w:tc>
+        <w:tc>
+          <w:tcPr>
+            <w:tcW w:type="dxa" w:w="1656"/>
+            <w:vAlign w:val="center"/>
+          </w:tcPr>
+          <w:p>
+            <w:r>
+              <w:t>418</w:t>
+            </w:r>
+          </w:p>
+        </w:tc>
+        <w:tc>
+          <w:tcPr>
+            <w:tcW w:type="dxa" w:w="1656"/>
+            <w:vAlign w:val="center"/>
+          </w:tcPr>
+          <w:p>
+            <w:r>
+              <w:t>17</w:t>
+            </w:r>
+          </w:p>
+        </w:tc>
+        <w:tc>
+          <w:tcPr>
+            <w:tcW w:type="dxa" w:w="1656"/>
+            <w:vAlign w:val="center"/>
+          </w:tcPr>
+          <w:p>
+            <w:r>
+              <w:t>69</w:t>
+            </w:r>
+          </w:p>
+        </w:tc>
+        <w:tc>
+          <w:tcPr>
+            <w:tcW w:type="dxa" w:w="1656"/>
+            <w:vAlign w:val="center"/>
+          </w:tcPr>
+          <w:p>
+            <w:r>
+              <w:t>332</w:t>
+            </w:r>
+          </w:p>
+        </w:tc>
+      </w:tr>
+      <w:tr>
+        <w:tc>
+          <w:tcPr>
+            <w:tcW w:type="dxa" w:w="1656"/>
+            <w:vAlign w:val="center"/>
+          </w:tcPr>
+          <w:p>
+            <w:r>
+              <w:t>2D</w:t>
+            </w:r>
+          </w:p>
+        </w:tc>
+        <w:tc>
+          <w:tcPr>
+            <w:tcW w:type="dxa" w:w="1656"/>
+            <w:vAlign w:val="center"/>
+          </w:tcPr>
+          <w:p>
+            <w:r>
+              <w:t>CV</w:t>
+            </w:r>
+          </w:p>
+        </w:tc>
+        <w:tc>
+          <w:tcPr>
+            <w:tcW w:type="dxa" w:w="1656"/>
+            <w:vAlign w:val="center"/>
+          </w:tcPr>
+          <w:p>
+            <w:r>
+              <w:t>690</w:t>
+            </w:r>
+          </w:p>
+        </w:tc>
+        <w:tc>
+          <w:tcPr>
+            <w:tcW w:type="dxa" w:w="1656"/>
+            <w:vAlign w:val="center"/>
+          </w:tcPr>
+          <w:p>
+            <w:r>
+              <w:t>20</w:t>
+            </w:r>
+          </w:p>
+        </w:tc>
+        <w:tc>
+          <w:tcPr>
+            <w:tcW w:type="dxa" w:w="1656"/>
+            <w:vAlign w:val="center"/>
+          </w:tcPr>
+          <w:p>
+            <w:r>
+              <w:t>179</w:t>
+            </w:r>
+          </w:p>
+        </w:tc>
+        <w:tc>
+          <w:tcPr>
+            <w:tcW w:type="dxa" w:w="1656"/>
+            <w:vAlign w:val="center"/>
+          </w:tcPr>
+          <w:p>
+            <w:r>
+              <w:t>491</w:t>
+            </w:r>
+          </w:p>
+        </w:tc>
+      </w:tr>
+      <w:tr>
+        <w:tc>
+          <w:tcPr>
+            <w:tcW w:type="dxa" w:w="1656"/>
+            <w:vAlign w:val="center"/>
+          </w:tcPr>
+          <w:p>
+            <w:r>
+              <w:t>2D</w:t>
+            </w:r>
+          </w:p>
+        </w:tc>
+        <w:tc>
+          <w:tcPr>
+            <w:tcW w:type="dxa" w:w="1656"/>
+            <w:vAlign w:val="center"/>
+          </w:tcPr>
+          <w:p>
+            <w:r>
+              <w:t>Pairwise relative difference</w:t>
+            </w:r>
+          </w:p>
+        </w:tc>
+        <w:tc>
+          <w:tcPr>
+            <w:tcW w:type="dxa" w:w="1656"/>
+            <w:vAlign w:val="center"/>
+          </w:tcPr>
+          <w:p>
+            <w:r>
+              <w:t>690</w:t>
+            </w:r>
+          </w:p>
+        </w:tc>
+        <w:tc>
+          <w:tcPr>
+            <w:tcW w:type="dxa" w:w="1656"/>
+            <w:vAlign w:val="center"/>
+          </w:tcPr>
+          <w:p>
+            <w:r>
+              <w:t>24</w:t>
+            </w:r>
+          </w:p>
+        </w:tc>
+        <w:tc>
+          <w:tcPr>
+            <w:tcW w:type="dxa" w:w="1656"/>
+            <w:vAlign w:val="center"/>
+          </w:tcPr>
+          <w:p>
+            <w:r>
+              <w:t>157</w:t>
+            </w:r>
+          </w:p>
+        </w:tc>
+        <w:tc>
+          <w:tcPr>
+            <w:tcW w:type="dxa" w:w="1656"/>
+            <w:vAlign w:val="center"/>
+          </w:tcPr>
+          <w:p>
+            <w:r>
+              <w:t>509</w:t>
+            </w:r>
+          </w:p>
+        </w:tc>
+      </w:tr>
+    </w:tbl>
+    <w:p/>
+    <w:p>
       <w:pPr>
         <w:pStyle w:val="Heading1"/>
       </w:pPr>
@@ -3730,7 +4110,7 @@
         <w:pStyle w:val="ListBullet"/>
       </w:pPr>
       <w:r>
-        <w:t>Companion organ-coordinate yaklaşımıyla aynı pair’ler ve aynı MIRP ayarlarında karşılaştırma yapılmalıdır.</w:t>
+        <w:t>Companion organ-coordinate yönteminin kodu/çıktıları bu paket içinde bulunmadığından, aynı pair ve MIRP ayarlarında doğrudan karşılaştırma henüz yapılamadı.</w:t>
       </w:r>
     </w:p>
     <w:p>

</xml_diff>

<commit_message>
feat: robust v7 registration (vertebrae-first landmarks, best-of transform selection)
Landmark rigid fallback now evaluates vertebrae-only and full bone label sets and keeps the transform with the highest stable bone-mask Dice; the primary correlation-rigid result is only used when it beats the landmark estimate. Fixes low-Dice cross-session pairs (PCCT spleen/aorta min Dice 0.49/0.66 to 0.90/0.90). Also adds SEP dataset compatibility (take1/base-series selection) and academic report transform/CI sections.
</commit_message>
<xml_diff>
--- a/RAPOR_AKADEMIK_REGISTRATION_RADIOMICS_V6.docx
+++ b/RAPOR_AKADEMIK_REGISTRATION_RADIOMICS_V6.docx
@@ -858,6 +858,716 @@
         <w:pStyle w:val="Heading1"/>
       </w:pPr>
       <w:r>
+        <w:t>Dönüşüm Bileşenlerinin Ayrıştırılması: Identity, Translation, Rotation ve Registration</w:t>
+      </w:r>
+    </w:p>
+    <w:p>
+      <w:r>
+        <w:t>Organ kaymasının hangi geometrik bileşenden kaynaklandığını ayırmak için, kohortun en büyük kaymasına sahip pair’lerinden biri olan 20260304 (yaklaşık 70 mm masa ötelemesi) üzerinde izole dönüşüm deneyi yapıldı. Aynı moving CT ve maskesi sırasıyla identity (dönüşümsüz), yalnız translasyon (centroid), yalnız rotasyon ve geliştirilen landmark rigid (Kabsch/SVD) registration ile fixed grid’e taşındı; her adımda Dice, centroid displacement, HD95 ve ASSD ölçüldü.</w:t>
+      </w:r>
+    </w:p>
+    <w:tbl>
+      <w:tblPr>
+        <w:tblStyle w:val="LightShading-Accent1"/>
+        <w:tblW w:type="auto" w:w="0"/>
+        <w:jc w:val="center"/>
+        <w:tblLook w:firstColumn="1" w:firstRow="1" w:lastColumn="0" w:lastRow="0" w:noHBand="0" w:noVBand="1" w:val="04A0"/>
+      </w:tblPr>
+      <w:tblGrid>
+        <w:gridCol w:w="1656"/>
+        <w:gridCol w:w="1656"/>
+        <w:gridCol w:w="1656"/>
+        <w:gridCol w:w="1656"/>
+        <w:gridCol w:w="1656"/>
+        <w:gridCol w:w="1656"/>
+      </w:tblGrid>
+      <w:tr>
+        <w:tc>
+          <w:tcPr>
+            <w:tcW w:type="dxa" w:w="1656"/>
+            <w:vAlign w:val="center"/>
+          </w:tcPr>
+          <w:p>
+            <w:r>
+              <w:rPr>
+                <w:b/>
+              </w:rPr>
+              <w:t>Dönüşüm</w:t>
+            </w:r>
+          </w:p>
+        </w:tc>
+        <w:tc>
+          <w:tcPr>
+            <w:tcW w:type="dxa" w:w="1656"/>
+            <w:vAlign w:val="center"/>
+          </w:tcPr>
+          <w:p>
+            <w:r>
+              <w:rPr>
+                <w:b/>
+              </w:rPr>
+              <w:t>Organ</w:t>
+            </w:r>
+          </w:p>
+        </w:tc>
+        <w:tc>
+          <w:tcPr>
+            <w:tcW w:type="dxa" w:w="1656"/>
+            <w:vAlign w:val="center"/>
+          </w:tcPr>
+          <w:p>
+            <w:r>
+              <w:rPr>
+                <w:b/>
+              </w:rPr>
+              <w:t>Dice</w:t>
+            </w:r>
+          </w:p>
+        </w:tc>
+        <w:tc>
+          <w:tcPr>
+            <w:tcW w:type="dxa" w:w="1656"/>
+            <w:vAlign w:val="center"/>
+          </w:tcPr>
+          <w:p>
+            <w:r>
+              <w:rPr>
+                <w:b/>
+              </w:rPr>
+              <w:t>Centroid (mm)</w:t>
+            </w:r>
+          </w:p>
+        </w:tc>
+        <w:tc>
+          <w:tcPr>
+            <w:tcW w:type="dxa" w:w="1656"/>
+            <w:vAlign w:val="center"/>
+          </w:tcPr>
+          <w:p>
+            <w:r>
+              <w:rPr>
+                <w:b/>
+              </w:rPr>
+              <w:t>HD95 (mm)</w:t>
+            </w:r>
+          </w:p>
+        </w:tc>
+        <w:tc>
+          <w:tcPr>
+            <w:tcW w:type="dxa" w:w="1656"/>
+            <w:vAlign w:val="center"/>
+          </w:tcPr>
+          <w:p>
+            <w:r>
+              <w:rPr>
+                <w:b/>
+              </w:rPr>
+              <w:t>ASSD (mm)</w:t>
+            </w:r>
+          </w:p>
+        </w:tc>
+      </w:tr>
+      <w:tr>
+        <w:tc>
+          <w:tcPr>
+            <w:tcW w:type="dxa" w:w="1656"/>
+            <w:vAlign w:val="center"/>
+          </w:tcPr>
+          <w:p>
+            <w:r>
+              <w:t>Identity</w:t>
+            </w:r>
+          </w:p>
+        </w:tc>
+        <w:tc>
+          <w:tcPr>
+            <w:tcW w:type="dxa" w:w="1656"/>
+            <w:vAlign w:val="center"/>
+          </w:tcPr>
+          <w:p>
+            <w:r>
+              <w:t>Spleen</w:t>
+            </w:r>
+          </w:p>
+        </w:tc>
+        <w:tc>
+          <w:tcPr>
+            <w:tcW w:type="dxa" w:w="1656"/>
+            <w:vAlign w:val="center"/>
+          </w:tcPr>
+          <w:p>
+            <w:r>
+              <w:t>0.0000</w:t>
+            </w:r>
+          </w:p>
+        </w:tc>
+        <w:tc>
+          <w:tcPr>
+            <w:tcW w:type="dxa" w:w="1656"/>
+            <w:vAlign w:val="center"/>
+          </w:tcPr>
+          <w:p>
+            <w:r>
+              <w:t>69.823</w:t>
+            </w:r>
+          </w:p>
+        </w:tc>
+        <w:tc>
+          <w:tcPr>
+            <w:tcW w:type="dxa" w:w="1656"/>
+            <w:vAlign w:val="center"/>
+          </w:tcPr>
+          <w:p>
+            <w:r>
+              <w:t>71.118</w:t>
+            </w:r>
+          </w:p>
+        </w:tc>
+        <w:tc>
+          <w:tcPr>
+            <w:tcW w:type="dxa" w:w="1656"/>
+            <w:vAlign w:val="center"/>
+          </w:tcPr>
+          <w:p>
+            <w:r>
+              <w:t>46.537</w:t>
+            </w:r>
+          </w:p>
+        </w:tc>
+      </w:tr>
+      <w:tr>
+        <w:tc>
+          <w:tcPr>
+            <w:tcW w:type="dxa" w:w="1656"/>
+            <w:vAlign w:val="center"/>
+          </w:tcPr>
+          <w:p>
+            <w:r>
+              <w:t>Identity</w:t>
+            </w:r>
+          </w:p>
+        </w:tc>
+        <w:tc>
+          <w:tcPr>
+            <w:tcW w:type="dxa" w:w="1656"/>
+            <w:vAlign w:val="center"/>
+          </w:tcPr>
+          <w:p>
+            <w:r>
+              <w:t>Aorta</w:t>
+            </w:r>
+          </w:p>
+        </w:tc>
+        <w:tc>
+          <w:tcPr>
+            <w:tcW w:type="dxa" w:w="1656"/>
+            <w:vAlign w:val="center"/>
+          </w:tcPr>
+          <w:p>
+            <w:r>
+              <w:t>0.0000</w:t>
+            </w:r>
+          </w:p>
+        </w:tc>
+        <w:tc>
+          <w:tcPr>
+            <w:tcW w:type="dxa" w:w="1656"/>
+            <w:vAlign w:val="center"/>
+          </w:tcPr>
+          <w:p>
+            <w:r>
+              <w:t>51.801</w:t>
+            </w:r>
+          </w:p>
+        </w:tc>
+        <w:tc>
+          <w:tcPr>
+            <w:tcW w:type="dxa" w:w="1656"/>
+            <w:vAlign w:val="center"/>
+          </w:tcPr>
+          <w:p>
+            <w:r>
+              <w:t>71.060</w:t>
+            </w:r>
+          </w:p>
+        </w:tc>
+        <w:tc>
+          <w:tcPr>
+            <w:tcW w:type="dxa" w:w="1656"/>
+            <w:vAlign w:val="center"/>
+          </w:tcPr>
+          <w:p>
+            <w:r>
+              <w:t>25.668</w:t>
+            </w:r>
+          </w:p>
+        </w:tc>
+      </w:tr>
+      <w:tr>
+        <w:tc>
+          <w:tcPr>
+            <w:tcW w:type="dxa" w:w="1656"/>
+            <w:vAlign w:val="center"/>
+          </w:tcPr>
+          <w:p>
+            <w:r>
+              <w:t>Translation-only</w:t>
+            </w:r>
+          </w:p>
+        </w:tc>
+        <w:tc>
+          <w:tcPr>
+            <w:tcW w:type="dxa" w:w="1656"/>
+            <w:vAlign w:val="center"/>
+          </w:tcPr>
+          <w:p>
+            <w:r>
+              <w:t>Spleen</w:t>
+            </w:r>
+          </w:p>
+        </w:tc>
+        <w:tc>
+          <w:tcPr>
+            <w:tcW w:type="dxa" w:w="1656"/>
+            <w:vAlign w:val="center"/>
+          </w:tcPr>
+          <w:p>
+            <w:r>
+              <w:t>0.9300</w:t>
+            </w:r>
+          </w:p>
+        </w:tc>
+        <w:tc>
+          <w:tcPr>
+            <w:tcW w:type="dxa" w:w="1656"/>
+            <w:vAlign w:val="center"/>
+          </w:tcPr>
+          <w:p>
+            <w:r>
+              <w:t>2.432</w:t>
+            </w:r>
+          </w:p>
+        </w:tc>
+        <w:tc>
+          <w:tcPr>
+            <w:tcW w:type="dxa" w:w="1656"/>
+            <w:vAlign w:val="center"/>
+          </w:tcPr>
+          <w:p>
+            <w:r>
+              <w:t>2.000</w:t>
+            </w:r>
+          </w:p>
+        </w:tc>
+        <w:tc>
+          <w:tcPr>
+            <w:tcW w:type="dxa" w:w="1656"/>
+            <w:vAlign w:val="center"/>
+          </w:tcPr>
+          <w:p>
+            <w:r>
+              <w:t>0.742</w:t>
+            </w:r>
+          </w:p>
+        </w:tc>
+      </w:tr>
+      <w:tr>
+        <w:tc>
+          <w:tcPr>
+            <w:tcW w:type="dxa" w:w="1656"/>
+            <w:vAlign w:val="center"/>
+          </w:tcPr>
+          <w:p>
+            <w:r>
+              <w:t>Translation-only</w:t>
+            </w:r>
+          </w:p>
+        </w:tc>
+        <w:tc>
+          <w:tcPr>
+            <w:tcW w:type="dxa" w:w="1656"/>
+            <w:vAlign w:val="center"/>
+          </w:tcPr>
+          <w:p>
+            <w:r>
+              <w:t>Aorta</w:t>
+            </w:r>
+          </w:p>
+        </w:tc>
+        <w:tc>
+          <w:tcPr>
+            <w:tcW w:type="dxa" w:w="1656"/>
+            <w:vAlign w:val="center"/>
+          </w:tcPr>
+          <w:p>
+            <w:r>
+              <w:t>0.9219</w:t>
+            </w:r>
+          </w:p>
+        </w:tc>
+        <w:tc>
+          <w:tcPr>
+            <w:tcW w:type="dxa" w:w="1656"/>
+            <w:vAlign w:val="center"/>
+          </w:tcPr>
+          <w:p>
+            <w:r>
+              <w:t>0.697</w:t>
+            </w:r>
+          </w:p>
+        </w:tc>
+        <w:tc>
+          <w:tcPr>
+            <w:tcW w:type="dxa" w:w="1656"/>
+            <w:vAlign w:val="center"/>
+          </w:tcPr>
+          <w:p>
+            <w:r>
+              <w:t>1.172</w:t>
+            </w:r>
+          </w:p>
+        </w:tc>
+        <w:tc>
+          <w:tcPr>
+            <w:tcW w:type="dxa" w:w="1656"/>
+            <w:vAlign w:val="center"/>
+          </w:tcPr>
+          <w:p>
+            <w:r>
+              <w:t>0.426</w:t>
+            </w:r>
+          </w:p>
+        </w:tc>
+      </w:tr>
+      <w:tr>
+        <w:tc>
+          <w:tcPr>
+            <w:tcW w:type="dxa" w:w="1656"/>
+            <w:vAlign w:val="center"/>
+          </w:tcPr>
+          <w:p>
+            <w:r>
+              <w:t>Rotation-only</w:t>
+            </w:r>
+          </w:p>
+        </w:tc>
+        <w:tc>
+          <w:tcPr>
+            <w:tcW w:type="dxa" w:w="1656"/>
+            <w:vAlign w:val="center"/>
+          </w:tcPr>
+          <w:p>
+            <w:r>
+              <w:t>Spleen</w:t>
+            </w:r>
+          </w:p>
+        </w:tc>
+        <w:tc>
+          <w:tcPr>
+            <w:tcW w:type="dxa" w:w="1656"/>
+            <w:vAlign w:val="center"/>
+          </w:tcPr>
+          <w:p>
+            <w:r>
+              <w:t>0.0000</w:t>
+            </w:r>
+          </w:p>
+        </w:tc>
+        <w:tc>
+          <w:tcPr>
+            <w:tcW w:type="dxa" w:w="1656"/>
+            <w:vAlign w:val="center"/>
+          </w:tcPr>
+          <w:p>
+            <w:r>
+              <w:t>163.537</w:t>
+            </w:r>
+          </w:p>
+        </w:tc>
+        <w:tc>
+          <w:tcPr>
+            <w:tcW w:type="dxa" w:w="1656"/>
+            <w:vAlign w:val="center"/>
+          </w:tcPr>
+          <w:p>
+            <w:r>
+              <w:t>156.895</w:t>
+            </w:r>
+          </w:p>
+        </w:tc>
+        <w:tc>
+          <w:tcPr>
+            <w:tcW w:type="dxa" w:w="1656"/>
+            <w:vAlign w:val="center"/>
+          </w:tcPr>
+          <w:p>
+            <w:r>
+              <w:t>129.443</w:t>
+            </w:r>
+          </w:p>
+        </w:tc>
+      </w:tr>
+      <w:tr>
+        <w:tc>
+          <w:tcPr>
+            <w:tcW w:type="dxa" w:w="1656"/>
+            <w:vAlign w:val="center"/>
+          </w:tcPr>
+          <w:p>
+            <w:r>
+              <w:t>Rotation-only</w:t>
+            </w:r>
+          </w:p>
+        </w:tc>
+        <w:tc>
+          <w:tcPr>
+            <w:tcW w:type="dxa" w:w="1656"/>
+            <w:vAlign w:val="center"/>
+          </w:tcPr>
+          <w:p>
+            <w:r>
+              <w:t>Aorta</w:t>
+            </w:r>
+          </w:p>
+        </w:tc>
+        <w:tc>
+          <w:tcPr>
+            <w:tcW w:type="dxa" w:w="1656"/>
+            <w:vAlign w:val="center"/>
+          </w:tcPr>
+          <w:p>
+            <w:r>
+              <w:t>0.0000</w:t>
+            </w:r>
+          </w:p>
+        </w:tc>
+        <w:tc>
+          <w:tcPr>
+            <w:tcW w:type="dxa" w:w="1656"/>
+            <w:vAlign w:val="center"/>
+          </w:tcPr>
+          <w:p>
+            <w:r>
+              <w:t>138.499</w:t>
+            </w:r>
+          </w:p>
+        </w:tc>
+        <w:tc>
+          <w:tcPr>
+            <w:tcW w:type="dxa" w:w="1656"/>
+            <w:vAlign w:val="center"/>
+          </w:tcPr>
+          <w:p>
+            <w:r>
+              <w:t>150.954</w:t>
+            </w:r>
+          </w:p>
+        </w:tc>
+        <w:tc>
+          <w:tcPr>
+            <w:tcW w:type="dxa" w:w="1656"/>
+            <w:vAlign w:val="center"/>
+          </w:tcPr>
+          <w:p>
+            <w:r>
+              <w:t>116.680</w:t>
+            </w:r>
+          </w:p>
+        </w:tc>
+      </w:tr>
+      <w:tr>
+        <w:tc>
+          <w:tcPr>
+            <w:tcW w:type="dxa" w:w="1656"/>
+            <w:vAlign w:val="center"/>
+          </w:tcPr>
+          <w:p>
+            <w:r>
+              <w:t>Landmark rigid</w:t>
+            </w:r>
+          </w:p>
+        </w:tc>
+        <w:tc>
+          <w:tcPr>
+            <w:tcW w:type="dxa" w:w="1656"/>
+            <w:vAlign w:val="center"/>
+          </w:tcPr>
+          <w:p>
+            <w:r>
+              <w:t>Spleen</w:t>
+            </w:r>
+          </w:p>
+        </w:tc>
+        <w:tc>
+          <w:tcPr>
+            <w:tcW w:type="dxa" w:w="1656"/>
+            <w:vAlign w:val="center"/>
+          </w:tcPr>
+          <w:p>
+            <w:r>
+              <w:t>0.9637</w:t>
+            </w:r>
+          </w:p>
+        </w:tc>
+        <w:tc>
+          <w:tcPr>
+            <w:tcW w:type="dxa" w:w="1656"/>
+            <w:vAlign w:val="center"/>
+          </w:tcPr>
+          <w:p>
+            <w:r>
+              <w:t>0.186</w:t>
+            </w:r>
+          </w:p>
+        </w:tc>
+        <w:tc>
+          <w:tcPr>
+            <w:tcW w:type="dxa" w:w="1656"/>
+            <w:vAlign w:val="center"/>
+          </w:tcPr>
+          <w:p>
+            <w:r>
+              <w:t>1.000</w:t>
+            </w:r>
+          </w:p>
+        </w:tc>
+        <w:tc>
+          <w:tcPr>
+            <w:tcW w:type="dxa" w:w="1656"/>
+            <w:vAlign w:val="center"/>
+          </w:tcPr>
+          <w:p>
+            <w:r>
+              <w:t>0.354</w:t>
+            </w:r>
+          </w:p>
+        </w:tc>
+      </w:tr>
+      <w:tr>
+        <w:tc>
+          <w:tcPr>
+            <w:tcW w:type="dxa" w:w="1656"/>
+            <w:vAlign w:val="center"/>
+          </w:tcPr>
+          <w:p>
+            <w:r>
+              <w:t>Landmark rigid</w:t>
+            </w:r>
+          </w:p>
+        </w:tc>
+        <w:tc>
+          <w:tcPr>
+            <w:tcW w:type="dxa" w:w="1656"/>
+            <w:vAlign w:val="center"/>
+          </w:tcPr>
+          <w:p>
+            <w:r>
+              <w:t>Aorta</w:t>
+            </w:r>
+          </w:p>
+        </w:tc>
+        <w:tc>
+          <w:tcPr>
+            <w:tcW w:type="dxa" w:w="1656"/>
+            <w:vAlign w:val="center"/>
+          </w:tcPr>
+          <w:p>
+            <w:r>
+              <w:t>0.9247</w:t>
+            </w:r>
+          </w:p>
+        </w:tc>
+        <w:tc>
+          <w:tcPr>
+            <w:tcW w:type="dxa" w:w="1656"/>
+            <w:vAlign w:val="center"/>
+          </w:tcPr>
+          <w:p>
+            <w:r>
+              <w:t>0.414</w:t>
+            </w:r>
+          </w:p>
+        </w:tc>
+        <w:tc>
+          <w:tcPr>
+            <w:tcW w:type="dxa" w:w="1656"/>
+            <w:vAlign w:val="center"/>
+          </w:tcPr>
+          <w:p>
+            <w:r>
+              <w:t>1.172</w:t>
+            </w:r>
+          </w:p>
+        </w:tc>
+        <w:tc>
+          <w:tcPr>
+            <w:tcW w:type="dxa" w:w="1656"/>
+            <w:vAlign w:val="center"/>
+          </w:tcPr>
+          <w:p>
+            <w:r>
+              <w:t>0.396</w:t>
+            </w:r>
+          </w:p>
+        </w:tc>
+      </w:tr>
+    </w:tbl>
+    <w:p/>
+    <w:p>
+      <w:r>
+        <w:drawing>
+          <wp:inline xmlns:a="http://schemas.openxmlformats.org/drawingml/2006/main" xmlns:pic="http://schemas.openxmlformats.org/drawingml/2006/picture">
+            <wp:extent cx="5852160" cy="3140184"/>
+            <wp:docPr id="3" name="Picture 3"/>
+            <wp:cNvGraphicFramePr>
+              <a:graphicFrameLocks noChangeAspect="1"/>
+            </wp:cNvGraphicFramePr>
+            <a:graphic>
+              <a:graphicData uri="http://schemas.openxmlformats.org/drawingml/2006/picture">
+                <pic:pic>
+                  <pic:nvPicPr>
+                    <pic:cNvPr id="0" name="transform_components_dice.png"/>
+                    <pic:cNvPicPr/>
+                  </pic:nvPicPr>
+                  <pic:blipFill>
+                    <a:blip r:embed="rId11"/>
+                    <a:stretch>
+                      <a:fillRect/>
+                    </a:stretch>
+                  </pic:blipFill>
+                  <pic:spPr>
+                    <a:xfrm>
+                      <a:off x="0" y="0"/>
+                      <a:ext cx="5852160" cy="3140184"/>
+                    </a:xfrm>
+                    <a:prstGeom prst="rect"/>
+                  </pic:spPr>
+                </pic:pic>
+              </a:graphicData>
+            </a:graphic>
+          </wp:inline>
+        </w:drawing>
+      </w:r>
+    </w:p>
+    <w:p>
+      <w:pPr>
+        <w:pStyle w:val="Caption"/>
+        <w:jc w:val="center"/>
+      </w:pPr>
+      <w:r>
+        <w:t>Şekil 3. Identity, translation-only, rotation-only ve landmark rigid registration sonrası spleen/aorta Dice değerleri.</w:t>
+      </w:r>
+    </w:p>
+    <w:p>
+      <w:r>
+        <w:t>Sonuçlar nedenselliği netleştirir: identity durumunda organlar tamamen ayrık kalır (Dice 0.00). Yalnız rotasyon uygulamak, öteleme telafi edilmediğinden kaldıraç kolu etkisiyle centroid kaymasını dalakta 69.8 mm’den 163.5 mm’ye çıkarır ve Dice’ı 0.00’da bırakır. Yalnız translasyon ise Dice’ı dalakta 0.930, aortada 0.922 seviyesine taşır; bu, longitudinal konum sapmasının büyük kısmının saf öteleme kaynaklı olduğunu gösterir. Klasik yoğunluk tabanlı rigid optimizer bu büyüklükteki kaymada ıraksayarak geçersiz sonuç (NaN) üretir. Geliştirilen landmark rigid registration ise rezidüel rotasyonu da düzelterek dalak Dice’ını 0.964’e, aorta Dice’ını 0.925’e yükseltir ve centroid kaymasını 0.19 mm (dalak) ve 0.41 mm (aorta) düzeyine, yani milimetre altına indirir.</w:t>
+      </w:r>
+    </w:p>
+    <w:p>
+      <w:pPr>
+        <w:pStyle w:val="Heading1"/>
+      </w:pPr>
+      <w:r>
         <w:t>Düşük Dice Pair’lerinin Görsel QC’si</w:t>
       </w:r>
     </w:p>
@@ -1069,7 +1779,7 @@
         <w:drawing>
           <wp:inline xmlns:a="http://schemas.openxmlformats.org/drawingml/2006/main" xmlns:pic="http://schemas.openxmlformats.org/drawingml/2006/picture">
             <wp:extent cx="5852160" cy="3601329"/>
-            <wp:docPr id="3" name="Picture 3"/>
+            <wp:docPr id="4" name="Picture 4"/>
             <wp:cNvGraphicFramePr>
               <a:graphicFrameLocks noChangeAspect="1"/>
             </wp:cNvGraphicFramePr>
@@ -1081,7 +1791,7 @@
                     <pic:cNvPicPr/>
                   </pic:nvPicPr>
                   <pic:blipFill>
-                    <a:blip r:embed="rId11"/>
+                    <a:blip r:embed="rId12"/>
                     <a:stretch>
                       <a:fillRect/>
                     </a:stretch>
@@ -1119,7 +1829,7 @@
         <w:drawing>
           <wp:inline xmlns:a="http://schemas.openxmlformats.org/drawingml/2006/main" xmlns:pic="http://schemas.openxmlformats.org/drawingml/2006/picture">
             <wp:extent cx="5852160" cy="3601329"/>
-            <wp:docPr id="4" name="Picture 4"/>
+            <wp:docPr id="5" name="Picture 5"/>
             <wp:cNvGraphicFramePr>
               <a:graphicFrameLocks noChangeAspect="1"/>
             </wp:cNvGraphicFramePr>
@@ -1131,7 +1841,7 @@
                     <pic:cNvPicPr/>
                   </pic:nvPicPr>
                   <pic:blipFill>
-                    <a:blip r:embed="rId12"/>
+                    <a:blip r:embed="rId13"/>
                     <a:stretch>
                       <a:fillRect/>
                     </a:stretch>
@@ -1169,7 +1879,7 @@
         <w:drawing>
           <wp:inline xmlns:a="http://schemas.openxmlformats.org/drawingml/2006/main" xmlns:pic="http://schemas.openxmlformats.org/drawingml/2006/picture">
             <wp:extent cx="5852160" cy="3601329"/>
-            <wp:docPr id="5" name="Picture 5"/>
+            <wp:docPr id="6" name="Picture 6"/>
             <wp:cNvGraphicFramePr>
               <a:graphicFrameLocks noChangeAspect="1"/>
             </wp:cNvGraphicFramePr>
@@ -1181,7 +1891,7 @@
                     <pic:cNvPicPr/>
                   </pic:nvPicPr>
                   <pic:blipFill>
-                    <a:blip r:embed="rId13"/>
+                    <a:blip r:embed="rId14"/>
                     <a:stretch>
                       <a:fillRect/>
                     </a:stretch>
@@ -1219,7 +1929,7 @@
         <w:drawing>
           <wp:inline xmlns:a="http://schemas.openxmlformats.org/drawingml/2006/main" xmlns:pic="http://schemas.openxmlformats.org/drawingml/2006/picture">
             <wp:extent cx="5852160" cy="3601329"/>
-            <wp:docPr id="6" name="Picture 6"/>
+            <wp:docPr id="7" name="Picture 7"/>
             <wp:cNvGraphicFramePr>
               <a:graphicFrameLocks noChangeAspect="1"/>
             </wp:cNvGraphicFramePr>
@@ -1231,7 +1941,7 @@
                     <pic:cNvPicPr/>
                   </pic:nvPicPr>
                   <pic:blipFill>
-                    <a:blip r:embed="rId14"/>
+                    <a:blip r:embed="rId15"/>
                     <a:stretch>
                       <a:fillRect/>
                     </a:stretch>
@@ -3834,7 +4544,7 @@
         <w:drawing>
           <wp:inline xmlns:a="http://schemas.openxmlformats.org/drawingml/2006/main" xmlns:pic="http://schemas.openxmlformats.org/drawingml/2006/picture">
             <wp:extent cx="5943600" cy="2377440"/>
-            <wp:docPr id="7" name="Picture 7"/>
+            <wp:docPr id="8" name="Picture 8"/>
             <wp:cNvGraphicFramePr>
               <a:graphicFrameLocks noChangeAspect="1"/>
             </wp:cNvGraphicFramePr>
@@ -3846,7 +4556,7 @@
                     <pic:cNvPicPr/>
                   </pic:nvPicPr>
                   <pic:blipFill>
-                    <a:blip r:embed="rId15"/>
+                    <a:blip r:embed="rId16"/>
                     <a:stretch>
                       <a:fillRect/>
                     </a:stretch>

</xml_diff>

<commit_message>
docs: update academic report to v1.0.0
Regenerates the academic report from batch_to_20260805_v1.0.0: updated Dice (0.9640/0.9329), >=0.90 counts (87/88, 88/88), method distribution, and a new all-pairs pairwise + analytics section covering SEP (68/2278) and PCCT (89/3916) with same-session identity methodology and outlier notes.
</commit_message>
<xml_diff>
--- a/RAPOR_AKADEMIK_REGISTRATION_RADIOMICS_V6.docx
+++ b/RAPOR_AKADEMIK_REGISTRATION_RADIOMICS_V6.docx
@@ -21,7 +21,7 @@
         <w:rPr>
           <w:i/>
         </w:rPr>
-        <w:t>V6 analiz raporu | 6 Ekim 2026</w:t>
+        <w:t>v1.0.0 analiz raporu | 26 Ekim 2026</w:t>
       </w:r>
     </w:p>
     <w:p/>
@@ -35,7 +35,7 @@
     </w:p>
     <w:p>
       <w:r>
-        <w:t>Bu çalışmada PhantomX longitudinal PCCT görüntülerinde spleen ve aorta maskelerinin fiziksel koordinat farklılıkları ve registration’ın radyomik tekrarlanabilirliğe etkisi incelendi. Toplam 88 moving seri, 20260805 take1 referansına karşı değerlendirildi. Registration sonrası ortalama Dice spleen için 0.257’ten 0.955’e, aorta için 0.260’ten 0.923’e yükseldi. En güvenilir fallback, vertebra/kaburga/sternum centroid’lerinden türetilen landmark rigid dönüşümü oldu. Bununla birlikte, radiomic feature tekrarlanabilirliği feature ailesine göre değişti; registration bütün feature’ları iyileştirmedi.</w:t>
+        <w:t>Bu çalışmada PhantomX longitudinal PCCT görüntülerinde spleen ve aorta maskelerinin fiziksel koordinat farklılıkları ve registration’ın radyomik tekrarlanabilirliğe etkisi incelendi. Toplam 88 moving seri, 20260805 take1 referansına karşı değerlendirildi. Registration sonrası ortalama Dice spleen için 0.257’ten 0.964’e, aorta için 0.260’ten 0.933’e yükseldi. En güvenilir fallback, vertebra/kaburga/sternum centroid’lerinden türetilen landmark rigid dönüşümü oldu. Bununla birlikte, radiomic feature tekrarlanabilirliği feature ailesine göre değişti; registration bütün feature’ları iyileştirmedi.</w:t>
       </w:r>
     </w:p>
     <w:p>
@@ -338,7 +338,7 @@
               <w:rPr>
                 <w:b/>
               </w:rPr>
-              <w:t>V6 ortalama final Dice</w:t>
+              <w:t>v1.0.0 ortalama final Dice</w:t>
             </w:r>
           </w:p>
         </w:tc>
@@ -384,7 +384,7 @@
           </w:tcPr>
           <w:p>
             <w:r>
-              <w:t>0.9551</w:t>
+              <w:t>0.9640</w:t>
             </w:r>
           </w:p>
         </w:tc>
@@ -430,7 +430,7 @@
           </w:tcPr>
           <w:p>
             <w:r>
-              <w:t>0.9229</w:t>
+              <w:t>0.9329</w:t>
             </w:r>
           </w:p>
         </w:tc>
@@ -549,7 +549,7 @@
           </w:tcPr>
           <w:p>
             <w:r>
-              <w:t>Ortalama Dice, V6 sonrası</w:t>
+              <w:t>Ortalama Dice, v1.0.0 sonrası</w:t>
             </w:r>
           </w:p>
         </w:tc>
@@ -560,7 +560,7 @@
           </w:tcPr>
           <w:p>
             <w:r>
-              <w:t>0.9551</w:t>
+              <w:t>0.9640</w:t>
             </w:r>
           </w:p>
         </w:tc>
@@ -571,7 +571,7 @@
           </w:tcPr>
           <w:p>
             <w:r>
-              <w:t>0.9229</w:t>
+              <w:t>0.9329</w:t>
             </w:r>
           </w:p>
         </w:tc>
@@ -595,7 +595,7 @@
           </w:tcPr>
           <w:p>
             <w:r>
-              <w:t>85 / 88</w:t>
+              <w:t>87 / 88</w:t>
             </w:r>
           </w:p>
         </w:tc>
@@ -606,7 +606,7 @@
           </w:tcPr>
           <w:p>
             <w:r>
-              <w:t>84 / 88</w:t>
+              <w:t>88 / 88</w:t>
             </w:r>
           </w:p>
         </w:tc>
@@ -670,7 +670,7 @@
               <w:rPr>
                 <w:b/>
               </w:rPr>
-              <w:t>V6 dönüşüm yöntemi</w:t>
+              <w:t>v1.0.0 dönüşüm yöntemi</w:t>
             </w:r>
           </w:p>
         </w:tc>
@@ -697,7 +697,7 @@
           </w:tcPr>
           <w:p>
             <w:r>
-              <w:t>landmark_rigid_fallback</w:t>
+              <w:t>landmark_rigid_vertebrae</w:t>
             </w:r>
           </w:p>
         </w:tc>
@@ -708,7 +708,7 @@
           </w:tcPr>
           <w:p>
             <w:r>
-              <w:t>78</w:t>
+              <w:t>33</w:t>
             </w:r>
           </w:p>
         </w:tc>
@@ -721,7 +721,7 @@
           </w:tcPr>
           <w:p>
             <w:r>
-              <w:t>rigid</w:t>
+              <w:t>landmark_rigid_fallback</w:t>
             </w:r>
           </w:p>
         </w:tc>
@@ -732,7 +732,7 @@
           </w:tcPr>
           <w:p>
             <w:r>
-              <w:t>1</w:t>
+              <w:t>46</w:t>
             </w:r>
           </w:p>
         </w:tc>
@@ -805,7 +805,7 @@
         <w:jc w:val="center"/>
       </w:pPr>
       <w:r>
-        <w:t>Şekil 1. V6 registration öncesi ve sonrası ortalama organ Dice değerleri.</w:t>
+        <w:t>Şekil 1. v1.0.0 registration öncesi ve sonrası ortalama organ Dice değerleri.</w:t>
       </w:r>
     </w:p>
     <w:p>
@@ -850,7 +850,7 @@
         <w:jc w:val="center"/>
       </w:pPr>
       <w:r>
-        <w:t>Şekil 2. V6’da pair başına kullanılan dönüşüm yöntemi.</w:t>
+        <w:t>Şekil 2. v1.0.0’da pair başına kullanılan dönüşüm yöntemi.</w:t>
       </w:r>
     </w:p>
     <w:p>
@@ -1635,7 +1635,7 @@
           </w:tcPr>
           <w:p>
             <w:r>
-              <w:t>20260410_PCCT_Aorta_Spleen / USZ_Siemens_Healthineers_NAEOTOM_Alpha_20260410_Q3_Qr40f_120_100_300_1_PolyE_take3</w:t>
+              <w:t>20260707_PCCT_Aorta_Spleen / USZ_Siemens_Healthineers_NAEOTOM_Alpha_20260707_Q3_Qr40f_120_100_300_1_PolyE_take3</w:t>
             </w:r>
           </w:p>
         </w:tc>
@@ -1646,7 +1646,7 @@
           </w:tcPr>
           <w:p>
             <w:r>
-              <w:t>0.707</w:t>
+              <w:t>0.898</w:t>
             </w:r>
           </w:p>
         </w:tc>
@@ -1657,112 +1657,7 @@
           </w:tcPr>
           <w:p>
             <w:r>
-              <w:t>0.485</w:t>
-            </w:r>
-          </w:p>
-        </w:tc>
-      </w:tr>
-      <w:tr>
-        <w:tc>
-          <w:tcPr>
-            <w:tcW w:type="dxa" w:w="3312"/>
-            <w:vAlign w:val="center"/>
-          </w:tcPr>
-          <w:p>
-            <w:r>
-              <w:t>20260707_PCCT_Aorta_Spleen / USZ_Siemens_Healthineers_NAEOTOM_Alpha_20260707_Q3_Qr40f_120_100_300_1_PolyE_take2</w:t>
-            </w:r>
-          </w:p>
-        </w:tc>
-        <w:tc>
-          <w:tcPr>
-            <w:tcW w:type="dxa" w:w="3312"/>
-            <w:vAlign w:val="center"/>
-          </w:tcPr>
-          <w:p>
-            <w:r>
-              <w:t>0.696</w:t>
-            </w:r>
-          </w:p>
-        </w:tc>
-        <w:tc>
-          <w:tcPr>
-            <w:tcW w:type="dxa" w:w="3312"/>
-            <w:vAlign w:val="center"/>
-          </w:tcPr>
-          <w:p>
-            <w:r>
-              <w:t>0.796</w:t>
-            </w:r>
-          </w:p>
-        </w:tc>
-      </w:tr>
-      <w:tr>
-        <w:tc>
-          <w:tcPr>
-            <w:tcW w:type="dxa" w:w="3312"/>
-            <w:vAlign w:val="center"/>
-          </w:tcPr>
-          <w:p>
-            <w:r>
-              <w:t>20260707_PCCT_Aorta_Spleen / USZ_Siemens_Healthineers_NAEOTOM_Alpha_20260707_Q3_Qr40f_120_100_300_1_PolyE_take3</w:t>
-            </w:r>
-          </w:p>
-        </w:tc>
-        <w:tc>
-          <w:tcPr>
-            <w:tcW w:type="dxa" w:w="3312"/>
-            <w:vAlign w:val="center"/>
-          </w:tcPr>
-          <w:p>
-            <w:r>
-              <w:t>0.664</w:t>
-            </w:r>
-          </w:p>
-        </w:tc>
-        <w:tc>
-          <w:tcPr>
-            <w:tcW w:type="dxa" w:w="3312"/>
-            <w:vAlign w:val="center"/>
-          </w:tcPr>
-          <w:p>
-            <w:r>
-              <w:t>0.775</w:t>
-            </w:r>
-          </w:p>
-        </w:tc>
-      </w:tr>
-      <w:tr>
-        <w:tc>
-          <w:tcPr>
-            <w:tcW w:type="dxa" w:w="3312"/>
-            <w:vAlign w:val="center"/>
-          </w:tcPr>
-          <w:p>
-            <w:r>
-              <w:t>20260730_PCCT_Aorta_Spleen / USZ_Siemens_Healthineers_NAEOTOM_Alpha_20260730_Q3_Qr40f_120_100_300_1_PolyE_take5</w:t>
-            </w:r>
-          </w:p>
-        </w:tc>
-        <w:tc>
-          <w:tcPr>
-            <w:tcW w:type="dxa" w:w="3312"/>
-            <w:vAlign w:val="center"/>
-          </w:tcPr>
-          <w:p>
-            <w:r>
-              <w:t>0.946</w:t>
-            </w:r>
-          </w:p>
-        </w:tc>
-        <w:tc>
-          <w:tcPr>
-            <w:tcW w:type="dxa" w:w="3312"/>
-            <w:vAlign w:val="center"/>
-          </w:tcPr>
-          <w:p>
-            <w:r>
-              <w:t>0.878</w:t>
+              <w:t>0.924</w:t>
             </w:r>
           </w:p>
         </w:tc>
@@ -1771,7 +1666,7 @@
     <w:p/>
     <w:p>
       <w:r>
-        <w:t>20260410_PCCT_Aorta_Spleen / USZ_Siemens_Healthineers_NAEOTOM_Alpha_20260410_Q3_Qr40f_120_100_300_1_PolyE_take3 — spleen 0.707, aorta 0.485</w:t>
+        <w:t>20260707_PCCT_Aorta_Spleen / USZ_Siemens_Healthineers_NAEOTOM_Alpha_20260707_Q3_Qr40f_120_100_300_1_PolyE_take3 — spleen 0.898, aorta 0.924</w:t>
       </w:r>
     </w:p>
     <w:p>
@@ -1787,161 +1682,11 @@
               <a:graphicData uri="http://schemas.openxmlformats.org/drawingml/2006/picture">
                 <pic:pic>
                   <pic:nvPicPr>
-                    <pic:cNvPr id="0" name="20260410_PCCT_Aorta_Spleen__USZ_Siemens_Healthineers_NAEOTOM_Alpha_20260410_Q3_Qr40f_120_100_300_1_PolyE_take3.png"/>
+                    <pic:cNvPr id="0" name="20260707_PCCT_Aorta_Spleen__USZ_Siemens_Healthineers_NAEOTOM_Alpha_20260707_Q3_Qr40f_120_100_300_1_PolyE_take3.png"/>
                     <pic:cNvPicPr/>
                   </pic:nvPicPr>
                   <pic:blipFill>
                     <a:blip r:embed="rId12"/>
-                    <a:stretch>
-                      <a:fillRect/>
-                    </a:stretch>
-                  </pic:blipFill>
-                  <pic:spPr>
-                    <a:xfrm>
-                      <a:off x="0" y="0"/>
-                      <a:ext cx="5852160" cy="3601329"/>
-                    </a:xfrm>
-                    <a:prstGeom prst="rect"/>
-                  </pic:spPr>
-                </pic:pic>
-              </a:graphicData>
-            </a:graphic>
-          </wp:inline>
-        </w:drawing>
-      </w:r>
-    </w:p>
-    <w:p>
-      <w:pPr>
-        <w:pStyle w:val="Caption"/>
-        <w:jc w:val="center"/>
-      </w:pPr>
-      <w:r>
-        <w:t>Şekil. Düşük overlap pair için identity ve registered maskelerin görsel karşılaştırması.</w:t>
-      </w:r>
-    </w:p>
-    <w:p>
-      <w:r>
-        <w:t>20260707_PCCT_Aorta_Spleen / USZ_Siemens_Healthineers_NAEOTOM_Alpha_20260707_Q3_Qr40f_120_100_300_1_PolyE_take2 — spleen 0.696, aorta 0.796</w:t>
-      </w:r>
-    </w:p>
-    <w:p>
-      <w:r>
-        <w:drawing>
-          <wp:inline xmlns:a="http://schemas.openxmlformats.org/drawingml/2006/main" xmlns:pic="http://schemas.openxmlformats.org/drawingml/2006/picture">
-            <wp:extent cx="5852160" cy="3601329"/>
-            <wp:docPr id="5" name="Picture 5"/>
-            <wp:cNvGraphicFramePr>
-              <a:graphicFrameLocks noChangeAspect="1"/>
-            </wp:cNvGraphicFramePr>
-            <a:graphic>
-              <a:graphicData uri="http://schemas.openxmlformats.org/drawingml/2006/picture">
-                <pic:pic>
-                  <pic:nvPicPr>
-                    <pic:cNvPr id="0" name="20260707_PCCT_Aorta_Spleen__USZ_Siemens_Healthineers_NAEOTOM_Alpha_20260707_Q3_Qr40f_120_100_300_1_PolyE_take2.png"/>
-                    <pic:cNvPicPr/>
-                  </pic:nvPicPr>
-                  <pic:blipFill>
-                    <a:blip r:embed="rId13"/>
-                    <a:stretch>
-                      <a:fillRect/>
-                    </a:stretch>
-                  </pic:blipFill>
-                  <pic:spPr>
-                    <a:xfrm>
-                      <a:off x="0" y="0"/>
-                      <a:ext cx="5852160" cy="3601329"/>
-                    </a:xfrm>
-                    <a:prstGeom prst="rect"/>
-                  </pic:spPr>
-                </pic:pic>
-              </a:graphicData>
-            </a:graphic>
-          </wp:inline>
-        </w:drawing>
-      </w:r>
-    </w:p>
-    <w:p>
-      <w:pPr>
-        <w:pStyle w:val="Caption"/>
-        <w:jc w:val="center"/>
-      </w:pPr>
-      <w:r>
-        <w:t>Şekil. Düşük overlap pair için identity ve registered maskelerin görsel karşılaştırması.</w:t>
-      </w:r>
-    </w:p>
-    <w:p>
-      <w:r>
-        <w:t>20260707_PCCT_Aorta_Spleen / USZ_Siemens_Healthineers_NAEOTOM_Alpha_20260707_Q3_Qr40f_120_100_300_1_PolyE_take3 — spleen 0.664, aorta 0.775</w:t>
-      </w:r>
-    </w:p>
-    <w:p>
-      <w:r>
-        <w:drawing>
-          <wp:inline xmlns:a="http://schemas.openxmlformats.org/drawingml/2006/main" xmlns:pic="http://schemas.openxmlformats.org/drawingml/2006/picture">
-            <wp:extent cx="5852160" cy="3601329"/>
-            <wp:docPr id="6" name="Picture 6"/>
-            <wp:cNvGraphicFramePr>
-              <a:graphicFrameLocks noChangeAspect="1"/>
-            </wp:cNvGraphicFramePr>
-            <a:graphic>
-              <a:graphicData uri="http://schemas.openxmlformats.org/drawingml/2006/picture">
-                <pic:pic>
-                  <pic:nvPicPr>
-                    <pic:cNvPr id="0" name="20260707_PCCT_Aorta_Spleen__USZ_Siemens_Healthineers_NAEOTOM_Alpha_20260707_Q3_Qr40f_120_100_300_1_PolyE_take3.png"/>
-                    <pic:cNvPicPr/>
-                  </pic:nvPicPr>
-                  <pic:blipFill>
-                    <a:blip r:embed="rId14"/>
-                    <a:stretch>
-                      <a:fillRect/>
-                    </a:stretch>
-                  </pic:blipFill>
-                  <pic:spPr>
-                    <a:xfrm>
-                      <a:off x="0" y="0"/>
-                      <a:ext cx="5852160" cy="3601329"/>
-                    </a:xfrm>
-                    <a:prstGeom prst="rect"/>
-                  </pic:spPr>
-                </pic:pic>
-              </a:graphicData>
-            </a:graphic>
-          </wp:inline>
-        </w:drawing>
-      </w:r>
-    </w:p>
-    <w:p>
-      <w:pPr>
-        <w:pStyle w:val="Caption"/>
-        <w:jc w:val="center"/>
-      </w:pPr>
-      <w:r>
-        <w:t>Şekil. Düşük overlap pair için identity ve registered maskelerin görsel karşılaştırması.</w:t>
-      </w:r>
-    </w:p>
-    <w:p>
-      <w:r>
-        <w:t>20260730_PCCT_Aorta_Spleen / USZ_Siemens_Healthineers_NAEOTOM_Alpha_20260730_Q3_Qr40f_120_100_300_1_PolyE_take5 — spleen 0.946, aorta 0.878</w:t>
-      </w:r>
-    </w:p>
-    <w:p>
-      <w:r>
-        <w:drawing>
-          <wp:inline xmlns:a="http://schemas.openxmlformats.org/drawingml/2006/main" xmlns:pic="http://schemas.openxmlformats.org/drawingml/2006/picture">
-            <wp:extent cx="5852160" cy="3601329"/>
-            <wp:docPr id="7" name="Picture 7"/>
-            <wp:cNvGraphicFramePr>
-              <a:graphicFrameLocks noChangeAspect="1"/>
-            </wp:cNvGraphicFramePr>
-            <a:graphic>
-              <a:graphicData uri="http://schemas.openxmlformats.org/drawingml/2006/picture">
-                <pic:pic>
-                  <pic:nvPicPr>
-                    <pic:cNvPr id="0" name="20260730_PCCT_Aorta_Spleen__USZ_Siemens_Healthineers_NAEOTOM_Alpha_20260730_Q3_Qr40f_120_100_300_1_PolyE_take5.png"/>
-                    <pic:cNvPicPr/>
-                  </pic:nvPicPr>
-                  <pic:blipFill>
-                    <a:blip r:embed="rId15"/>
                     <a:stretch>
                       <a:fillRect/>
                     </a:stretch>
@@ -4544,7 +4289,7 @@
         <w:drawing>
           <wp:inline xmlns:a="http://schemas.openxmlformats.org/drawingml/2006/main" xmlns:pic="http://schemas.openxmlformats.org/drawingml/2006/picture">
             <wp:extent cx="5943600" cy="2377440"/>
-            <wp:docPr id="8" name="Picture 8"/>
+            <wp:docPr id="5" name="Picture 5"/>
             <wp:cNvGraphicFramePr>
               <a:graphicFrameLocks noChangeAspect="1"/>
             </wp:cNvGraphicFramePr>
@@ -4556,7 +4301,7 @@
                     <pic:cNvPicPr/>
                   </pic:nvPicPr>
                   <pic:blipFill>
-                    <a:blip r:embed="rId16"/>
+                    <a:blip r:embed="rId13"/>
                     <a:stretch>
                       <a:fillRect/>
                     </a:stretch>
@@ -4767,12 +4512,237 @@
         <w:pStyle w:val="Heading1"/>
       </w:pPr>
       <w:r>
+        <w:t>Tüm-Çift Pairwise Raporu ve Analitik Sayfa</w:t>
+      </w:r>
+    </w:p>
+    <w:p>
+      <w:r>
+        <w:t>Organ maskelerinin yalnızca tek bir fixed referansa göre değil, tüm seri çiftleri arasında da karşılaştırılabilmesi için SEP ve PCCT veri setleri için all-pairs pairwise raporları üretildi. Aynı oturum çiftleri kendi oturum referans grid'inde identity ile (zaten hizalı oldukları için), farklı oturum çiftleri ise fixed-referans registration sonrası karşılaştırıldı. Her çift için Dice, ASSD, HD95 ve clDice hesaplandı; sonuçlar Summary, Pairs, Improvements, Date_Summary ve Dice_Diagnostics sayfalarıyla Excel'e yazıldı.</w:t>
+      </w:r>
+    </w:p>
+    <w:tbl>
+      <w:tblPr>
+        <w:tblStyle w:val="LightShading-Accent1"/>
+        <w:tblW w:type="auto" w:w="0"/>
+        <w:jc w:val="center"/>
+        <w:tblLook w:firstColumn="1" w:firstRow="1" w:lastColumn="0" w:lastRow="0" w:noHBand="0" w:noVBand="1" w:val="04A0"/>
+      </w:tblPr>
+      <w:tblGrid>
+        <w:gridCol w:w="1987"/>
+        <w:gridCol w:w="1987"/>
+        <w:gridCol w:w="1987"/>
+        <w:gridCol w:w="1987"/>
+        <w:gridCol w:w="1987"/>
+      </w:tblGrid>
+      <w:tr>
+        <w:tc>
+          <w:tcPr>
+            <w:tcW w:type="dxa" w:w="1987"/>
+            <w:vAlign w:val="center"/>
+          </w:tcPr>
+          <w:p>
+            <w:r>
+              <w:rPr>
+                <w:b/>
+              </w:rPr>
+              <w:t>Veri seti</w:t>
+            </w:r>
+          </w:p>
+        </w:tc>
+        <w:tc>
+          <w:tcPr>
+            <w:tcW w:type="dxa" w:w="1987"/>
+            <w:vAlign w:val="center"/>
+          </w:tcPr>
+          <w:p>
+            <w:r>
+              <w:rPr>
+                <w:b/>
+              </w:rPr>
+              <w:t>Seri</w:t>
+            </w:r>
+          </w:p>
+        </w:tc>
+        <w:tc>
+          <w:tcPr>
+            <w:tcW w:type="dxa" w:w="1987"/>
+            <w:vAlign w:val="center"/>
+          </w:tcPr>
+          <w:p>
+            <w:r>
+              <w:rPr>
+                <w:b/>
+              </w:rPr>
+              <w:t>Pair</w:t>
+            </w:r>
+          </w:p>
+        </w:tc>
+        <w:tc>
+          <w:tcPr>
+            <w:tcW w:type="dxa" w:w="1987"/>
+            <w:vAlign w:val="center"/>
+          </w:tcPr>
+          <w:p>
+            <w:r>
+              <w:rPr>
+                <w:b/>
+              </w:rPr>
+              <w:t>Aynı oturum</w:t>
+            </w:r>
+          </w:p>
+        </w:tc>
+        <w:tc>
+          <w:tcPr>
+            <w:tcW w:type="dxa" w:w="1987"/>
+            <w:vAlign w:val="center"/>
+          </w:tcPr>
+          <w:p>
+            <w:r>
+              <w:rPr>
+                <w:b/>
+              </w:rPr>
+              <w:t>Farklı oturum</w:t>
+            </w:r>
+          </w:p>
+        </w:tc>
+      </w:tr>
+      <w:tr>
+        <w:tc>
+          <w:tcPr>
+            <w:tcW w:type="dxa" w:w="1987"/>
+            <w:vAlign w:val="center"/>
+          </w:tcPr>
+          <w:p>
+            <w:r>
+              <w:t>SEP</w:t>
+            </w:r>
+          </w:p>
+        </w:tc>
+        <w:tc>
+          <w:tcPr>
+            <w:tcW w:type="dxa" w:w="1987"/>
+            <w:vAlign w:val="center"/>
+          </w:tcPr>
+          <w:p>
+            <w:r>
+              <w:t>68</w:t>
+            </w:r>
+          </w:p>
+        </w:tc>
+        <w:tc>
+          <w:tcPr>
+            <w:tcW w:type="dxa" w:w="1987"/>
+            <w:vAlign w:val="center"/>
+          </w:tcPr>
+          <w:p>
+            <w:r>
+              <w:t>2278</w:t>
+            </w:r>
+          </w:p>
+        </w:tc>
+        <w:tc>
+          <w:tcPr>
+            <w:tcW w:type="dxa" w:w="1987"/>
+            <w:vAlign w:val="center"/>
+          </w:tcPr>
+          <w:p>
+            <w:r>
+              <w:t>389</w:t>
+            </w:r>
+          </w:p>
+        </w:tc>
+        <w:tc>
+          <w:tcPr>
+            <w:tcW w:type="dxa" w:w="1987"/>
+            <w:vAlign w:val="center"/>
+          </w:tcPr>
+          <w:p>
+            <w:r>
+              <w:t>1889</w:t>
+            </w:r>
+          </w:p>
+        </w:tc>
+      </w:tr>
+      <w:tr>
+        <w:tc>
+          <w:tcPr>
+            <w:tcW w:type="dxa" w:w="1987"/>
+            <w:vAlign w:val="center"/>
+          </w:tcPr>
+          <w:p>
+            <w:r>
+              <w:t>PCCT</w:t>
+            </w:r>
+          </w:p>
+        </w:tc>
+        <w:tc>
+          <w:tcPr>
+            <w:tcW w:type="dxa" w:w="1987"/>
+            <w:vAlign w:val="center"/>
+          </w:tcPr>
+          <w:p>
+            <w:r>
+              <w:t>89</w:t>
+            </w:r>
+          </w:p>
+        </w:tc>
+        <w:tc>
+          <w:tcPr>
+            <w:tcW w:type="dxa" w:w="1987"/>
+            <w:vAlign w:val="center"/>
+          </w:tcPr>
+          <w:p>
+            <w:r>
+              <w:t>3916</w:t>
+            </w:r>
+          </w:p>
+        </w:tc>
+        <w:tc>
+          <w:tcPr>
+            <w:tcW w:type="dxa" w:w="1987"/>
+            <w:vAlign w:val="center"/>
+          </w:tcPr>
+          <w:p>
+            <w:r>
+              <w:t>186</w:t>
+            </w:r>
+          </w:p>
+        </w:tc>
+        <w:tc>
+          <w:tcPr>
+            <w:tcW w:type="dxa" w:w="1987"/>
+            <w:vAlign w:val="center"/>
+          </w:tcPr>
+          <w:p>
+            <w:r>
+              <w:t>3730</w:t>
+            </w:r>
+          </w:p>
+        </w:tc>
+      </w:tr>
+    </w:tbl>
+    <w:p/>
+    <w:p>
+      <w:r>
+        <w:t>Aynı oturum içindeki tekrarlar yüksek Dice verdi (identity); farklı oturumlarda rigid/landmark registration Dice'ı belirgin biçimde yükseltti. Düşük Dice'lı seriler dışlanmadı, gerekçeleriyle notlandı: SEP'te 20260731_t20 (zayıf rigid hizalama, HD95 4–5 mm) ve 20260128_t1 (identity; segmentasyon/şekil), PCCT'te 20260601_t1 (HD95 2.0 mm, aorta sınırlayıcı) ve 20260622_t3 (ince kemik kabuğu/şekil farkı). 20260622 _s1005 ise _s2087 ile aynı ışınlamadır; Dice'ı iyi olduğu için kalite nedeniyle değil, yalnızca çift sayımı kaygısıyla ayrıca belirtilmiştir.</w:t>
+      </w:r>
+    </w:p>
+    <w:p>
+      <w:r>
+        <w:t>Etkileşimli analitik sayfa; tüm-çift Dice matrisini (mutlak Dice ve kazanç modları), Dice dağılımını, tarih-çifti kazanç sıralamasını ve düşük Dice tanılamasını içerir: https://erayakgunn.github.io/registration-overlay/analytics.html</w:t>
+      </w:r>
+    </w:p>
+    <w:p>
+      <w:pPr>
+        <w:pStyle w:val="Heading1"/>
+      </w:pPr>
+      <w:r>
         <w:t>Tartışma</w:t>
       </w:r>
     </w:p>
     <w:p>
       <w:r>
-        <w:t>V6, organ maskelerinin spatial overlap’ını kuvvetle artırdı. Aynı zamanda session-aware analiz, radyomik repeatability etkisinin feature-dependent olduğunu gösterdi. Registered ve identity/world-space arasındaki feature farkları resampling/interpolation etkisini de içerir. Dolayısıyla geometrik Dice iyileşmesi doğrudan radiomic reproducibility iyileşmesi olarak yorumlanmamalıdır. Özellikle GLCM/GLRLM gibi texture ailelerinde 2D/3D tanımları ve pooling yöntemleri ayrı değerlendirilmelidir.</w:t>
+        <w:t>v1.0.0, organ maskelerinin spatial overlap’ını kuvvetle artırdı. Aynı zamanda session-aware analiz, radyomik repeatability etkisinin feature-dependent olduğunu gösterdi. Registered ve identity/world-space arasındaki feature farkları resampling/interpolation etkisini de içerir. Dolayısıyla geometrik Dice iyileşmesi doğrudan radiomic reproducibility iyileşmesi olarak yorumlanmamalıdır. Özellikle GLCM/GLRLM gibi texture ailelerinde 2D/3D tanımları ve pooling yöntemleri ayrı değerlendirilmelidir.</w:t>
       </w:r>
     </w:p>
     <w:p>
@@ -4833,7 +4803,7 @@
     </w:p>
     <w:p>
       <w:r>
-        <w:t>V6’da rigid ve landmark/centroid tabanlı spatial standardization, longitudinal PhantomX organ maskelerinin geometrik uyumunu belirgin biçimde artırdı. Ancak radiomic repeatability’de kazanım tüm feature’lara yayılmadı; bazı feature ailelerinde iyileşme, bazılarında kötüleşme görüldü. Bu nedenle registration’ın gerekliliği organ ve feature ailesi bazında değerlendirilmeli; identity/world-space resampling kontrolü ve companion yöntem karşılaştırması tamamlanmadan tüm radiomics için genel üstünlük iddia edilmemelidir.</w:t>
+        <w:t>v1.0.0’da rigid ve landmark/centroid tabanlı spatial standardization, longitudinal PhantomX organ maskelerinin geometrik uyumunu belirgin biçimde artırdı. Ancak radiomic repeatability’de kazanım tüm feature’lara yayılmadı; bazı feature ailelerinde iyileşme, bazılarında kötüleşme görüldü. Bu nedenle registration’ın gerekliliği organ ve feature ailesi bazında değerlendirilmeli; identity/world-space resampling kontrolü ve companion yöntem karşılaştırması tamamlanmadan tüm radiomics için genel üstünlük iddia edilmemelidir.</w:t>
       </w:r>
     </w:p>
     <w:sectPr>

</xml_diff>